<commit_message>
Day3 Docs udpated traefik
</commit_message>
<xml_diff>
--- a/K3s_15Day_Revised_TOC.docx
+++ b/K3s_15Day_Revised_TOC.docx
@@ -638,14 +638,18 @@
           <w:numId w:val="24"/>
         </w:numPr>
         <w:spacing w:before="0" w:after="40"/>
-        <w:rPr/>
-      </w:pPr>
-      <w:r>
-        <w:rPr>
-          <w:rFonts w:eastAsia="Calibri" w:cs="Calibri" w:ascii="Calibri" w:hAnsi="Calibri"/>
-          <w:color w:val="222222"/>
-          <w:sz w:val="20"/>
-          <w:szCs w:val="20"/>
+        <w:rPr>
+          <w:highlight w:val="none"/>
+          <w:shd w:fill="81D41A" w:val="clear"/>
+        </w:rPr>
+      </w:pPr>
+      <w:r>
+        <w:rPr>
+          <w:rFonts w:eastAsia="Calibri" w:cs="Calibri" w:ascii="Calibri" w:hAnsi="Calibri"/>
+          <w:color w:val="222222"/>
+          <w:sz w:val="20"/>
+          <w:szCs w:val="20"/>
+          <w:shd w:fill="81D41A" w:val="clear"/>
         </w:rPr>
         <w:t>Hands-on</w:t>
       </w:r>
@@ -687,7 +691,10 @@
           <w:bottom w:val="single" w:sz="6" w:space="2" w:color="2E7D6B"/>
         </w:pBdr>
         <w:spacing w:before="160" w:after="80"/>
-        <w:rPr/>
+        <w:rPr>
+          <w:highlight w:val="none"/>
+          <w:shd w:fill="81D41A" w:val="clear"/>
+        </w:rPr>
       </w:pPr>
       <w:r>
         <w:rPr>
@@ -697,6 +704,7 @@
           <w:color w:val="2E7D6B"/>
           <w:sz w:val="22"/>
           <w:szCs w:val="22"/>
+          <w:shd w:fill="81D41A" w:val="clear"/>
         </w:rPr>
         <w:t>Day 02 – RBAC &amp; Service Accounts (Deep Dive)</w:t>
       </w:r>
@@ -709,14 +717,18 @@
           <w:numId w:val="25"/>
         </w:numPr>
         <w:spacing w:before="0" w:after="40"/>
-        <w:rPr/>
-      </w:pPr>
-      <w:r>
-        <w:rPr>
-          <w:rFonts w:eastAsia="Calibri" w:cs="Calibri" w:ascii="Calibri" w:hAnsi="Calibri"/>
-          <w:color w:val="222222"/>
-          <w:sz w:val="20"/>
-          <w:szCs w:val="20"/>
+        <w:rPr>
+          <w:highlight w:val="none"/>
+          <w:shd w:fill="81D41A" w:val="clear"/>
+        </w:rPr>
+      </w:pPr>
+      <w:r>
+        <w:rPr>
+          <w:rFonts w:eastAsia="Calibri" w:cs="Calibri" w:ascii="Calibri" w:hAnsi="Calibri"/>
+          <w:color w:val="222222"/>
+          <w:sz w:val="20"/>
+          <w:szCs w:val="20"/>
+          <w:shd w:fill="81D41A" w:val="clear"/>
         </w:rPr>
         <w:t>Service Accounts</w:t>
       </w:r>
@@ -729,14 +741,18 @@
           <w:numId w:val="26"/>
         </w:numPr>
         <w:spacing w:before="0" w:after="40"/>
-        <w:rPr/>
-      </w:pPr>
-      <w:r>
-        <w:rPr>
-          <w:rFonts w:eastAsia="Calibri" w:cs="Calibri" w:ascii="Calibri" w:hAnsi="Calibri"/>
-          <w:color w:val="222222"/>
-          <w:sz w:val="20"/>
-          <w:szCs w:val="20"/>
+        <w:rPr>
+          <w:highlight w:val="none"/>
+          <w:shd w:fill="81D41A" w:val="clear"/>
+        </w:rPr>
+      </w:pPr>
+      <w:r>
+        <w:rPr>
+          <w:rFonts w:eastAsia="Calibri" w:cs="Calibri" w:ascii="Calibri" w:hAnsi="Calibri"/>
+          <w:color w:val="222222"/>
+          <w:sz w:val="20"/>
+          <w:szCs w:val="20"/>
+          <w:shd w:fill="81D41A" w:val="clear"/>
         </w:rPr>
         <w:t>RBAC</w:t>
       </w:r>
@@ -749,14 +765,18 @@
           <w:numId w:val="27"/>
         </w:numPr>
         <w:spacing w:before="0" w:after="40"/>
-        <w:rPr/>
-      </w:pPr>
-      <w:r>
-        <w:rPr>
-          <w:rFonts w:eastAsia="Calibri" w:cs="Calibri" w:ascii="Calibri" w:hAnsi="Calibri"/>
-          <w:color w:val="222222"/>
-          <w:sz w:val="20"/>
-          <w:szCs w:val="20"/>
+        <w:rPr>
+          <w:highlight w:val="none"/>
+          <w:shd w:fill="81D41A" w:val="clear"/>
+        </w:rPr>
+      </w:pPr>
+      <w:r>
+        <w:rPr>
+          <w:rFonts w:eastAsia="Calibri" w:cs="Calibri" w:ascii="Calibri" w:hAnsi="Calibri"/>
+          <w:color w:val="222222"/>
+          <w:sz w:val="20"/>
+          <w:szCs w:val="20"/>
+          <w:shd w:fill="81D41A" w:val="clear"/>
         </w:rPr>
         <w:t>Roles</w:t>
       </w:r>
@@ -769,14 +789,18 @@
           <w:numId w:val="28"/>
         </w:numPr>
         <w:spacing w:before="0" w:after="40"/>
-        <w:rPr/>
-      </w:pPr>
-      <w:r>
-        <w:rPr>
-          <w:rFonts w:eastAsia="Calibri" w:cs="Calibri" w:ascii="Calibri" w:hAnsi="Calibri"/>
-          <w:color w:val="222222"/>
-          <w:sz w:val="20"/>
-          <w:szCs w:val="20"/>
+        <w:rPr>
+          <w:highlight w:val="none"/>
+          <w:shd w:fill="81D41A" w:val="clear"/>
+        </w:rPr>
+      </w:pPr>
+      <w:r>
+        <w:rPr>
+          <w:rFonts w:eastAsia="Calibri" w:cs="Calibri" w:ascii="Calibri" w:hAnsi="Calibri"/>
+          <w:color w:val="222222"/>
+          <w:sz w:val="20"/>
+          <w:szCs w:val="20"/>
+          <w:shd w:fill="81D41A" w:val="clear"/>
         </w:rPr>
         <w:t>ClusterRoles</w:t>
       </w:r>
@@ -789,14 +813,18 @@
           <w:numId w:val="29"/>
         </w:numPr>
         <w:spacing w:before="0" w:after="40"/>
-        <w:rPr/>
-      </w:pPr>
-      <w:r>
-        <w:rPr>
-          <w:rFonts w:eastAsia="Calibri" w:cs="Calibri" w:ascii="Calibri" w:hAnsi="Calibri"/>
-          <w:color w:val="222222"/>
-          <w:sz w:val="20"/>
-          <w:szCs w:val="20"/>
+        <w:rPr>
+          <w:highlight w:val="none"/>
+          <w:shd w:fill="81D41A" w:val="clear"/>
+        </w:rPr>
+      </w:pPr>
+      <w:r>
+        <w:rPr>
+          <w:rFonts w:eastAsia="Calibri" w:cs="Calibri" w:ascii="Calibri" w:hAnsi="Calibri"/>
+          <w:color w:val="222222"/>
+          <w:sz w:val="20"/>
+          <w:szCs w:val="20"/>
+          <w:shd w:fill="81D41A" w:val="clear"/>
         </w:rPr>
         <w:t>RoleBindings</w:t>
       </w:r>
@@ -809,14 +837,18 @@
           <w:numId w:val="30"/>
         </w:numPr>
         <w:spacing w:before="0" w:after="40"/>
-        <w:rPr/>
-      </w:pPr>
-      <w:r>
-        <w:rPr>
-          <w:rFonts w:eastAsia="Calibri" w:cs="Calibri" w:ascii="Calibri" w:hAnsi="Calibri"/>
-          <w:color w:val="222222"/>
-          <w:sz w:val="20"/>
-          <w:szCs w:val="20"/>
+        <w:rPr>
+          <w:highlight w:val="none"/>
+          <w:shd w:fill="81D41A" w:val="clear"/>
+        </w:rPr>
+      </w:pPr>
+      <w:r>
+        <w:rPr>
+          <w:rFonts w:eastAsia="Calibri" w:cs="Calibri" w:ascii="Calibri" w:hAnsi="Calibri"/>
+          <w:color w:val="222222"/>
+          <w:sz w:val="20"/>
+          <w:szCs w:val="20"/>
+          <w:shd w:fill="81D41A" w:val="clear"/>
         </w:rPr>
         <w:t>ClusterRoleBindings</w:t>
       </w:r>
@@ -829,14 +861,18 @@
           <w:numId w:val="31"/>
         </w:numPr>
         <w:spacing w:before="0" w:after="40"/>
-        <w:rPr/>
-      </w:pPr>
-      <w:r>
-        <w:rPr>
-          <w:rFonts w:eastAsia="Calibri" w:cs="Calibri" w:ascii="Calibri" w:hAnsi="Calibri"/>
-          <w:color w:val="222222"/>
-          <w:sz w:val="20"/>
-          <w:szCs w:val="20"/>
+        <w:rPr>
+          <w:highlight w:val="none"/>
+          <w:shd w:fill="81D41A" w:val="clear"/>
+        </w:rPr>
+      </w:pPr>
+      <w:r>
+        <w:rPr>
+          <w:rFonts w:eastAsia="Calibri" w:cs="Calibri" w:ascii="Calibri" w:hAnsi="Calibri"/>
+          <w:color w:val="222222"/>
+          <w:sz w:val="20"/>
+          <w:szCs w:val="20"/>
+          <w:shd w:fill="81D41A" w:val="clear"/>
         </w:rPr>
         <w:t>RBAC Best Practices</w:t>
       </w:r>
@@ -849,14 +885,18 @@
           <w:numId w:val="32"/>
         </w:numPr>
         <w:spacing w:before="0" w:after="40"/>
-        <w:rPr/>
-      </w:pPr>
-      <w:r>
-        <w:rPr>
-          <w:rFonts w:eastAsia="Calibri" w:cs="Calibri" w:ascii="Calibri" w:hAnsi="Calibri"/>
-          <w:color w:val="222222"/>
-          <w:sz w:val="20"/>
-          <w:szCs w:val="20"/>
+        <w:rPr>
+          <w:highlight w:val="none"/>
+          <w:shd w:fill="81D41A" w:val="clear"/>
+        </w:rPr>
+      </w:pPr>
+      <w:r>
+        <w:rPr>
+          <w:rFonts w:eastAsia="Calibri" w:cs="Calibri" w:ascii="Calibri" w:hAnsi="Calibri"/>
+          <w:color w:val="222222"/>
+          <w:sz w:val="20"/>
+          <w:szCs w:val="20"/>
+          <w:shd w:fill="81D41A" w:val="clear"/>
         </w:rPr>
         <w:t>Real-world RBAC design scenarios for multi-team namespace access</w:t>
       </w:r>
@@ -869,14 +909,18 @@
           <w:numId w:val="33"/>
         </w:numPr>
         <w:spacing w:before="0" w:after="40"/>
-        <w:rPr/>
-      </w:pPr>
-      <w:r>
-        <w:rPr>
-          <w:rFonts w:eastAsia="Calibri" w:cs="Calibri" w:ascii="Calibri" w:hAnsi="Calibri"/>
-          <w:color w:val="222222"/>
-          <w:sz w:val="20"/>
-          <w:szCs w:val="20"/>
+        <w:rPr>
+          <w:highlight w:val="none"/>
+          <w:shd w:fill="81D41A" w:val="clear"/>
+        </w:rPr>
+      </w:pPr>
+      <w:r>
+        <w:rPr>
+          <w:rFonts w:eastAsia="Calibri" w:cs="Calibri" w:ascii="Calibri" w:hAnsi="Calibri"/>
+          <w:color w:val="222222"/>
+          <w:sz w:val="20"/>
+          <w:szCs w:val="20"/>
+          <w:shd w:fill="81D41A" w:val="clear"/>
         </w:rPr>
         <w:t>Troubleshooting RBAC and permission issues</w:t>
       </w:r>
@@ -889,14 +933,18 @@
           <w:numId w:val="34"/>
         </w:numPr>
         <w:spacing w:before="0" w:after="40"/>
-        <w:rPr/>
-      </w:pPr>
-      <w:r>
-        <w:rPr>
-          <w:rFonts w:eastAsia="Calibri" w:cs="Calibri" w:ascii="Calibri" w:hAnsi="Calibri"/>
-          <w:color w:val="222222"/>
-          <w:sz w:val="20"/>
-          <w:szCs w:val="20"/>
+        <w:rPr>
+          <w:highlight w:val="none"/>
+          <w:shd w:fill="81D41A" w:val="clear"/>
+        </w:rPr>
+      </w:pPr>
+      <w:r>
+        <w:rPr>
+          <w:rFonts w:eastAsia="Calibri" w:cs="Calibri" w:ascii="Calibri" w:hAnsi="Calibri"/>
+          <w:color w:val="222222"/>
+          <w:sz w:val="20"/>
+          <w:szCs w:val="20"/>
+          <w:shd w:fill="81D41A" w:val="clear"/>
         </w:rPr>
         <w:t>Hands-on</w:t>
       </w:r>
@@ -1008,14 +1056,18 @@
           <w:numId w:val="37"/>
         </w:numPr>
         <w:spacing w:before="0" w:after="40"/>
-        <w:rPr/>
-      </w:pPr>
-      <w:r>
-        <w:rPr>
-          <w:rFonts w:eastAsia="Calibri" w:cs="Calibri" w:ascii="Calibri" w:hAnsi="Calibri"/>
-          <w:color w:val="222222"/>
-          <w:sz w:val="20"/>
-          <w:szCs w:val="20"/>
+        <w:rPr>
+          <w:highlight w:val="none"/>
+          <w:shd w:fill="81D41A" w:val="clear"/>
+        </w:rPr>
+      </w:pPr>
+      <w:r>
+        <w:rPr>
+          <w:rFonts w:eastAsia="Calibri" w:cs="Calibri" w:ascii="Calibri" w:hAnsi="Calibri"/>
+          <w:color w:val="222222"/>
+          <w:sz w:val="20"/>
+          <w:szCs w:val="20"/>
+          <w:shd w:fill="81D41A" w:val="clear"/>
         </w:rPr>
         <w:t>LoadBalancer</w:t>
       </w:r>
@@ -1028,14 +1080,18 @@
           <w:numId w:val="38"/>
         </w:numPr>
         <w:spacing w:before="0" w:after="40"/>
-        <w:rPr/>
-      </w:pPr>
-      <w:r>
-        <w:rPr>
-          <w:rFonts w:eastAsia="Calibri" w:cs="Calibri" w:ascii="Calibri" w:hAnsi="Calibri"/>
-          <w:color w:val="222222"/>
-          <w:sz w:val="20"/>
-          <w:szCs w:val="20"/>
+        <w:rPr>
+          <w:highlight w:val="none"/>
+          <w:shd w:fill="81D41A" w:val="clear"/>
+        </w:rPr>
+      </w:pPr>
+      <w:r>
+        <w:rPr>
+          <w:rFonts w:eastAsia="Calibri" w:cs="Calibri" w:ascii="Calibri" w:hAnsi="Calibri"/>
+          <w:color w:val="222222"/>
+          <w:sz w:val="20"/>
+          <w:szCs w:val="20"/>
+          <w:shd w:fill="81D41A" w:val="clear"/>
         </w:rPr>
         <w:t>ExternalName</w:t>
       </w:r>
@@ -1048,14 +1104,18 @@
           <w:numId w:val="39"/>
         </w:numPr>
         <w:spacing w:before="0" w:after="40"/>
-        <w:rPr/>
-      </w:pPr>
-      <w:r>
-        <w:rPr>
-          <w:rFonts w:eastAsia="Calibri" w:cs="Calibri" w:ascii="Calibri" w:hAnsi="Calibri"/>
-          <w:color w:val="222222"/>
-          <w:sz w:val="20"/>
-          <w:szCs w:val="20"/>
+        <w:rPr>
+          <w:highlight w:val="none"/>
+          <w:shd w:fill="81D41A" w:val="clear"/>
+        </w:rPr>
+      </w:pPr>
+      <w:r>
+        <w:rPr>
+          <w:rFonts w:eastAsia="Calibri" w:cs="Calibri" w:ascii="Calibri" w:hAnsi="Calibri"/>
+          <w:color w:val="222222"/>
+          <w:sz w:val="20"/>
+          <w:szCs w:val="20"/>
+          <w:shd w:fill="81D41A" w:val="clear"/>
         </w:rPr>
         <w:t>Headless Service</w:t>
       </w:r>
@@ -1068,14 +1128,18 @@
           <w:numId w:val="40"/>
         </w:numPr>
         <w:spacing w:before="0" w:after="40"/>
-        <w:rPr/>
-      </w:pPr>
-      <w:r>
-        <w:rPr>
-          <w:rFonts w:eastAsia="Calibri" w:cs="Calibri" w:ascii="Calibri" w:hAnsi="Calibri"/>
-          <w:color w:val="222222"/>
-          <w:sz w:val="20"/>
-          <w:szCs w:val="20"/>
+        <w:rPr>
+          <w:highlight w:val="none"/>
+          <w:shd w:fill="81D41A" w:val="clear"/>
+        </w:rPr>
+      </w:pPr>
+      <w:r>
+        <w:rPr>
+          <w:rFonts w:eastAsia="Calibri" w:cs="Calibri" w:ascii="Calibri" w:hAnsi="Calibri"/>
+          <w:color w:val="222222"/>
+          <w:sz w:val="20"/>
+          <w:szCs w:val="20"/>
+          <w:shd w:fill="81D41A" w:val="clear"/>
         </w:rPr>
         <w:t>DNS</w:t>
       </w:r>
@@ -1136,14 +1200,18 @@
           <w:numId w:val="43"/>
         </w:numPr>
         <w:spacing w:before="0" w:after="40"/>
-        <w:rPr/>
-      </w:pPr>
-      <w:r>
-        <w:rPr>
-          <w:rFonts w:eastAsia="Calibri" w:cs="Calibri" w:ascii="Calibri" w:hAnsi="Calibri"/>
-          <w:color w:val="222222"/>
-          <w:sz w:val="20"/>
-          <w:szCs w:val="20"/>
+        <w:rPr>
+          <w:highlight w:val="none"/>
+          <w:shd w:fill="81D41A" w:val="clear"/>
+        </w:rPr>
+      </w:pPr>
+      <w:r>
+        <w:rPr>
+          <w:rFonts w:eastAsia="Calibri" w:cs="Calibri" w:ascii="Calibri" w:hAnsi="Calibri"/>
+          <w:color w:val="222222"/>
+          <w:sz w:val="20"/>
+          <w:szCs w:val="20"/>
+          <w:shd w:fill="81D41A" w:val="clear"/>
         </w:rPr>
         <w:t>Network Policies</w:t>
       </w:r>
@@ -1156,14 +1224,18 @@
           <w:numId w:val="44"/>
         </w:numPr>
         <w:spacing w:before="0" w:after="40"/>
-        <w:rPr/>
-      </w:pPr>
-      <w:r>
-        <w:rPr>
-          <w:rFonts w:eastAsia="Calibri" w:cs="Calibri" w:ascii="Calibri" w:hAnsi="Calibri"/>
-          <w:color w:val="222222"/>
-          <w:sz w:val="20"/>
-          <w:szCs w:val="20"/>
+        <w:rPr>
+          <w:highlight w:val="none"/>
+          <w:shd w:fill="81D41A" w:val="clear"/>
+        </w:rPr>
+      </w:pPr>
+      <w:r>
+        <w:rPr>
+          <w:rFonts w:eastAsia="Calibri" w:cs="Calibri" w:ascii="Calibri" w:hAnsi="Calibri"/>
+          <w:color w:val="222222"/>
+          <w:sz w:val="20"/>
+          <w:szCs w:val="20"/>
+          <w:shd w:fill="81D41A" w:val="clear"/>
         </w:rPr>
         <w:t>Hands-on</w:t>
       </w:r>
@@ -1197,14 +1269,18 @@
           <w:numId w:val="45"/>
         </w:numPr>
         <w:spacing w:before="0" w:after="40"/>
-        <w:rPr/>
-      </w:pPr>
-      <w:r>
-        <w:rPr>
-          <w:rFonts w:eastAsia="Calibri" w:cs="Calibri" w:ascii="Calibri" w:hAnsi="Calibri"/>
-          <w:color w:val="222222"/>
-          <w:sz w:val="20"/>
-          <w:szCs w:val="20"/>
+        <w:rPr>
+          <w:highlight w:val="none"/>
+          <w:shd w:fill="81D41A" w:val="clear"/>
+        </w:rPr>
+      </w:pPr>
+      <w:r>
+        <w:rPr>
+          <w:rFonts w:eastAsia="Calibri" w:cs="Calibri" w:ascii="Calibri" w:hAnsi="Calibri"/>
+          <w:color w:val="222222"/>
+          <w:sz w:val="20"/>
+          <w:szCs w:val="20"/>
+          <w:shd w:fill="81D41A" w:val="clear"/>
         </w:rPr>
         <w:t>Flannel</w:t>
       </w:r>
@@ -1217,14 +1293,18 @@
           <w:numId w:val="46"/>
         </w:numPr>
         <w:spacing w:before="0" w:after="40"/>
-        <w:rPr/>
-      </w:pPr>
-      <w:r>
-        <w:rPr>
-          <w:rFonts w:eastAsia="Calibri" w:cs="Calibri" w:ascii="Calibri" w:hAnsi="Calibri"/>
-          <w:color w:val="222222"/>
-          <w:sz w:val="20"/>
-          <w:szCs w:val="20"/>
+        <w:rPr>
+          <w:highlight w:val="none"/>
+          <w:shd w:fill="81D41A" w:val="clear"/>
+        </w:rPr>
+      </w:pPr>
+      <w:r>
+        <w:rPr>
+          <w:rFonts w:eastAsia="Calibri" w:cs="Calibri" w:ascii="Calibri" w:hAnsi="Calibri"/>
+          <w:color w:val="222222"/>
+          <w:sz w:val="20"/>
+          <w:szCs w:val="20"/>
+          <w:shd w:fill="81D41A" w:val="clear"/>
         </w:rPr>
         <w:t>Canal</w:t>
       </w:r>
@@ -1237,14 +1317,18 @@
           <w:numId w:val="47"/>
         </w:numPr>
         <w:spacing w:before="0" w:after="40"/>
-        <w:rPr/>
-      </w:pPr>
-      <w:r>
-        <w:rPr>
-          <w:rFonts w:eastAsia="Calibri" w:cs="Calibri" w:ascii="Calibri" w:hAnsi="Calibri"/>
-          <w:color w:val="222222"/>
-          <w:sz w:val="20"/>
-          <w:szCs w:val="20"/>
+        <w:rPr>
+          <w:highlight w:val="none"/>
+          <w:shd w:fill="81D41A" w:val="clear"/>
+        </w:rPr>
+      </w:pPr>
+      <w:r>
+        <w:rPr>
+          <w:rFonts w:eastAsia="Calibri" w:cs="Calibri" w:ascii="Calibri" w:hAnsi="Calibri"/>
+          <w:color w:val="222222"/>
+          <w:sz w:val="20"/>
+          <w:szCs w:val="20"/>
+          <w:shd w:fill="81D41A" w:val="clear"/>
         </w:rPr>
         <w:t>Calico</w:t>
       </w:r>
@@ -1257,14 +1341,18 @@
           <w:numId w:val="48"/>
         </w:numPr>
         <w:spacing w:before="0" w:after="40"/>
-        <w:rPr/>
-      </w:pPr>
-      <w:r>
-        <w:rPr>
-          <w:rFonts w:eastAsia="Calibri" w:cs="Calibri" w:ascii="Calibri" w:hAnsi="Calibri"/>
-          <w:color w:val="222222"/>
-          <w:sz w:val="20"/>
-          <w:szCs w:val="20"/>
+        <w:rPr>
+          <w:highlight w:val="none"/>
+          <w:shd w:fill="81D41A" w:val="clear"/>
+        </w:rPr>
+      </w:pPr>
+      <w:r>
+        <w:rPr>
+          <w:rFonts w:eastAsia="Calibri" w:cs="Calibri" w:ascii="Calibri" w:hAnsi="Calibri"/>
+          <w:color w:val="222222"/>
+          <w:sz w:val="20"/>
+          <w:szCs w:val="20"/>
+          <w:shd w:fill="81D41A" w:val="clear"/>
         </w:rPr>
         <w:t>Cilium Overview</w:t>
       </w:r>
@@ -1277,14 +1365,18 @@
           <w:numId w:val="49"/>
         </w:numPr>
         <w:spacing w:before="0" w:after="40"/>
-        <w:rPr/>
-      </w:pPr>
-      <w:r>
-        <w:rPr>
-          <w:rFonts w:eastAsia="Calibri" w:cs="Calibri" w:ascii="Calibri" w:hAnsi="Calibri"/>
-          <w:color w:val="222222"/>
-          <w:sz w:val="20"/>
-          <w:szCs w:val="20"/>
+        <w:rPr>
+          <w:highlight w:val="none"/>
+          <w:shd w:fill="81D41A" w:val="clear"/>
+        </w:rPr>
+      </w:pPr>
+      <w:r>
+        <w:rPr>
+          <w:rFonts w:eastAsia="Calibri" w:cs="Calibri" w:ascii="Calibri" w:hAnsi="Calibri"/>
+          <w:color w:val="222222"/>
+          <w:sz w:val="20"/>
+          <w:szCs w:val="20"/>
+          <w:shd w:fill="81D41A" w:val="clear"/>
         </w:rPr>
         <w:t>Pod Networking</w:t>
       </w:r>
@@ -1297,14 +1389,18 @@
           <w:numId w:val="50"/>
         </w:numPr>
         <w:spacing w:before="0" w:after="40"/>
-        <w:rPr/>
-      </w:pPr>
-      <w:r>
-        <w:rPr>
-          <w:rFonts w:eastAsia="Calibri" w:cs="Calibri" w:ascii="Calibri" w:hAnsi="Calibri"/>
-          <w:color w:val="222222"/>
-          <w:sz w:val="20"/>
-          <w:szCs w:val="20"/>
+        <w:rPr>
+          <w:highlight w:val="none"/>
+          <w:shd w:fill="81D41A" w:val="clear"/>
+        </w:rPr>
+      </w:pPr>
+      <w:r>
+        <w:rPr>
+          <w:rFonts w:eastAsia="Calibri" w:cs="Calibri" w:ascii="Calibri" w:hAnsi="Calibri"/>
+          <w:color w:val="222222"/>
+          <w:sz w:val="20"/>
+          <w:szCs w:val="20"/>
+          <w:shd w:fill="81D41A" w:val="clear"/>
         </w:rPr>
         <w:t>Node Networking</w:t>
       </w:r>
@@ -1317,14 +1413,18 @@
           <w:numId w:val="51"/>
         </w:numPr>
         <w:spacing w:before="0" w:after="40"/>
-        <w:rPr/>
-      </w:pPr>
-      <w:r>
-        <w:rPr>
-          <w:rFonts w:eastAsia="Calibri" w:cs="Calibri" w:ascii="Calibri" w:hAnsi="Calibri"/>
-          <w:color w:val="222222"/>
-          <w:sz w:val="20"/>
-          <w:szCs w:val="20"/>
+        <w:rPr>
+          <w:highlight w:val="none"/>
+          <w:shd w:fill="81D41A" w:val="clear"/>
+        </w:rPr>
+      </w:pPr>
+      <w:r>
+        <w:rPr>
+          <w:rFonts w:eastAsia="Calibri" w:cs="Calibri" w:ascii="Calibri" w:hAnsi="Calibri"/>
+          <w:color w:val="222222"/>
+          <w:sz w:val="20"/>
+          <w:szCs w:val="20"/>
+          <w:shd w:fill="81D41A" w:val="clear"/>
         </w:rPr>
         <w:t>Service Networking</w:t>
       </w:r>
@@ -1337,14 +1437,18 @@
           <w:numId w:val="52"/>
         </w:numPr>
         <w:spacing w:before="0" w:after="40"/>
-        <w:rPr/>
-      </w:pPr>
-      <w:r>
-        <w:rPr>
-          <w:rFonts w:eastAsia="Calibri" w:cs="Calibri" w:ascii="Calibri" w:hAnsi="Calibri"/>
-          <w:color w:val="222222"/>
-          <w:sz w:val="20"/>
-          <w:szCs w:val="20"/>
+        <w:rPr>
+          <w:highlight w:val="none"/>
+          <w:shd w:fill="81D41A" w:val="clear"/>
+        </w:rPr>
+      </w:pPr>
+      <w:r>
+        <w:rPr>
+          <w:rFonts w:eastAsia="Calibri" w:cs="Calibri" w:ascii="Calibri" w:hAnsi="Calibri"/>
+          <w:color w:val="222222"/>
+          <w:sz w:val="20"/>
+          <w:szCs w:val="20"/>
+          <w:shd w:fill="81D41A" w:val="clear"/>
         </w:rPr>
         <w:t>DNS</w:t>
       </w:r>
@@ -1357,14 +1461,18 @@
           <w:numId w:val="53"/>
         </w:numPr>
         <w:spacing w:before="0" w:after="40"/>
-        <w:rPr/>
-      </w:pPr>
-      <w:r>
-        <w:rPr>
-          <w:rFonts w:eastAsia="Calibri" w:cs="Calibri" w:ascii="Calibri" w:hAnsi="Calibri"/>
-          <w:color w:val="222222"/>
-          <w:sz w:val="20"/>
-          <w:szCs w:val="20"/>
+        <w:rPr>
+          <w:highlight w:val="none"/>
+          <w:shd w:fill="81D41A" w:val="clear"/>
+        </w:rPr>
+      </w:pPr>
+      <w:r>
+        <w:rPr>
+          <w:rFonts w:eastAsia="Calibri" w:cs="Calibri" w:ascii="Calibri" w:hAnsi="Calibri"/>
+          <w:color w:val="222222"/>
+          <w:sz w:val="20"/>
+          <w:szCs w:val="20"/>
+          <w:shd w:fill="81D41A" w:val="clear"/>
         </w:rPr>
         <w:t>CoreDNS</w:t>
       </w:r>

</xml_diff>

<commit_message>
capstone and D7 docs updated
</commit_message>
<xml_diff>
--- a/K3s_15Day_Revised_TOC.docx
+++ b/K3s_15Day_Revised_TOC.docx
@@ -2501,7 +2501,10 @@
           <w:numId w:val="227"/>
         </w:numPr>
         <w:spacing w:before="0" w:after="40"/>
-        <w:rPr/>
+        <w:rPr>
+          <w:highlight w:val="none"/>
+          <w:shd w:fill="81D41A" w:val="clear"/>
+        </w:rPr>
       </w:pPr>
       <w:r>
         <w:rPr>
@@ -2509,6 +2512,7 @@
           <w:color w:val="222222"/>
           <w:sz w:val="20"/>
           <w:szCs w:val="20"/>
+          <w:shd w:fill="81D41A" w:val="clear"/>
         </w:rPr>
         <w:t>Certificate Rotation</w:t>
       </w:r>
@@ -2521,7 +2525,10 @@
           <w:numId w:val="228"/>
         </w:numPr>
         <w:spacing w:before="0" w:after="40"/>
-        <w:rPr/>
+        <w:rPr>
+          <w:highlight w:val="none"/>
+          <w:shd w:fill="81D41A" w:val="clear"/>
+        </w:rPr>
       </w:pPr>
       <w:r>
         <w:rPr>
@@ -2529,6 +2536,7 @@
           <w:color w:val="222222"/>
           <w:sz w:val="20"/>
           <w:szCs w:val="20"/>
+          <w:shd w:fill="81D41A" w:val="clear"/>
         </w:rPr>
         <w:t>Backup</w:t>
       </w:r>
@@ -2541,7 +2549,10 @@
           <w:numId w:val="229"/>
         </w:numPr>
         <w:spacing w:before="0" w:after="40"/>
-        <w:rPr/>
+        <w:rPr>
+          <w:highlight w:val="none"/>
+          <w:shd w:fill="81D41A" w:val="clear"/>
+        </w:rPr>
       </w:pPr>
       <w:r>
         <w:rPr>
@@ -2549,6 +2560,7 @@
           <w:color w:val="222222"/>
           <w:sz w:val="20"/>
           <w:szCs w:val="20"/>
+          <w:shd w:fill="81D41A" w:val="clear"/>
         </w:rPr>
         <w:t>Restore</w:t>
       </w:r>
@@ -2561,7 +2573,10 @@
           <w:numId w:val="230"/>
         </w:numPr>
         <w:spacing w:before="0" w:after="40"/>
-        <w:rPr/>
+        <w:rPr>
+          <w:highlight w:val="none"/>
+          <w:shd w:fill="81D41A" w:val="clear"/>
+        </w:rPr>
       </w:pPr>
       <w:r>
         <w:rPr>
@@ -2569,6 +2584,7 @@
           <w:color w:val="222222"/>
           <w:sz w:val="20"/>
           <w:szCs w:val="20"/>
+          <w:shd w:fill="81D41A" w:val="clear"/>
         </w:rPr>
         <w:t>Disaster Recovery</w:t>
       </w:r>
@@ -2581,7 +2597,10 @@
           <w:numId w:val="231"/>
         </w:numPr>
         <w:spacing w:before="0" w:after="40"/>
-        <w:rPr/>
+        <w:rPr>
+          <w:highlight w:val="none"/>
+          <w:shd w:fill="81D41A" w:val="clear"/>
+        </w:rPr>
       </w:pPr>
       <w:r>
         <w:rPr>
@@ -2589,6 +2608,7 @@
           <w:color w:val="222222"/>
           <w:sz w:val="20"/>
           <w:szCs w:val="20"/>
+          <w:shd w:fill="81D41A" w:val="clear"/>
         </w:rPr>
         <w:t>Hands-on</w:t>
       </w:r>
@@ -2630,7 +2650,10 @@
           <w:bottom w:val="single" w:sz="6" w:space="2" w:color="2E7D6B"/>
         </w:pBdr>
         <w:spacing w:before="160" w:after="80"/>
-        <w:rPr/>
+        <w:rPr>
+          <w:highlight w:val="none"/>
+          <w:shd w:fill="81D41A" w:val="clear"/>
+        </w:rPr>
       </w:pPr>
       <w:r>
         <w:rPr>
@@ -2640,6 +2663,7 @@
           <w:color w:val="2E7D6B"/>
           <w:sz w:val="22"/>
           <w:szCs w:val="22"/>
+          <w:shd w:fill="81D41A" w:val="clear"/>
         </w:rPr>
         <w:t>Day 09 – Performance &amp; Scaling</w:t>
       </w:r>
@@ -2652,7 +2676,10 @@
           <w:numId w:val="232"/>
         </w:numPr>
         <w:spacing w:before="0" w:after="40"/>
-        <w:rPr/>
+        <w:rPr>
+          <w:highlight w:val="none"/>
+          <w:shd w:fill="81D41A" w:val="clear"/>
+        </w:rPr>
       </w:pPr>
       <w:r>
         <w:rPr>
@@ -2660,6 +2687,7 @@
           <w:color w:val="222222"/>
           <w:sz w:val="20"/>
           <w:szCs w:val="20"/>
+          <w:shd w:fill="81D41A" w:val="clear"/>
         </w:rPr>
         <w:t>Performance Optimization</w:t>
       </w:r>
@@ -2672,7 +2700,10 @@
           <w:numId w:val="233"/>
         </w:numPr>
         <w:spacing w:before="0" w:after="40"/>
-        <w:rPr/>
+        <w:rPr>
+          <w:highlight w:val="none"/>
+          <w:shd w:fill="81D41A" w:val="clear"/>
+        </w:rPr>
       </w:pPr>
       <w:r>
         <w:rPr>
@@ -2680,6 +2711,7 @@
           <w:color w:val="222222"/>
           <w:sz w:val="20"/>
           <w:szCs w:val="20"/>
+          <w:shd w:fill="81D41A" w:val="clear"/>
         </w:rPr>
         <w:t>Scaling Applications</w:t>
       </w:r>
@@ -2692,7 +2724,10 @@
           <w:numId w:val="234"/>
         </w:numPr>
         <w:spacing w:before="0" w:after="40"/>
-        <w:rPr/>
+        <w:rPr>
+          <w:highlight w:val="none"/>
+          <w:shd w:fill="81D41A" w:val="clear"/>
+        </w:rPr>
       </w:pPr>
       <w:r>
         <w:rPr>
@@ -2700,6 +2735,7 @@
           <w:color w:val="222222"/>
           <w:sz w:val="20"/>
           <w:szCs w:val="20"/>
+          <w:shd w:fill="81D41A" w:val="clear"/>
         </w:rPr>
         <w:t>Horizontal Pod Autoscaler</w:t>
       </w:r>
@@ -2712,7 +2748,10 @@
           <w:numId w:val="235"/>
         </w:numPr>
         <w:spacing w:before="0" w:after="40"/>
-        <w:rPr/>
+        <w:rPr>
+          <w:highlight w:val="none"/>
+          <w:shd w:fill="81D41A" w:val="clear"/>
+        </w:rPr>
       </w:pPr>
       <w:r>
         <w:rPr>
@@ -2720,6 +2759,7 @@
           <w:color w:val="222222"/>
           <w:sz w:val="20"/>
           <w:szCs w:val="20"/>
+          <w:shd w:fill="81D41A" w:val="clear"/>
         </w:rPr>
         <w:t>Vertical Pod Autoscaler</w:t>
       </w:r>
@@ -2732,7 +2772,10 @@
           <w:numId w:val="236"/>
         </w:numPr>
         <w:spacing w:before="0" w:after="40"/>
-        <w:rPr/>
+        <w:rPr>
+          <w:highlight w:val="none"/>
+          <w:shd w:fill="81D41A" w:val="clear"/>
+        </w:rPr>
       </w:pPr>
       <w:r>
         <w:rPr>
@@ -2740,6 +2783,7 @@
           <w:color w:val="222222"/>
           <w:sz w:val="20"/>
           <w:szCs w:val="20"/>
+          <w:shd w:fill="81D41A" w:val="clear"/>
         </w:rPr>
         <w:t>Cluster Autoscaler Concepts</w:t>
       </w:r>
@@ -2752,7 +2796,10 @@
           <w:numId w:val="237"/>
         </w:numPr>
         <w:spacing w:before="0" w:after="40"/>
-        <w:rPr/>
+        <w:rPr>
+          <w:highlight w:val="none"/>
+          <w:shd w:fill="81D41A" w:val="clear"/>
+        </w:rPr>
       </w:pPr>
       <w:r>
         <w:rPr>
@@ -2760,6 +2807,7 @@
           <w:color w:val="222222"/>
           <w:sz w:val="20"/>
           <w:szCs w:val="20"/>
+          <w:shd w:fill="81D41A" w:val="clear"/>
         </w:rPr>
         <w:t>Resource Optimization</w:t>
       </w:r>
@@ -2772,7 +2820,10 @@
           <w:numId w:val="238"/>
         </w:numPr>
         <w:spacing w:before="0" w:after="40"/>
-        <w:rPr/>
+        <w:rPr>
+          <w:highlight w:val="none"/>
+          <w:shd w:fill="81D41A" w:val="clear"/>
+        </w:rPr>
       </w:pPr>
       <w:r>
         <w:rPr>
@@ -2780,6 +2831,7 @@
           <w:color w:val="222222"/>
           <w:sz w:val="20"/>
           <w:szCs w:val="20"/>
+          <w:shd w:fill="81D41A" w:val="clear"/>
         </w:rPr>
         <w:t>Capacity Planning</w:t>
       </w:r>
@@ -2792,7 +2844,10 @@
           <w:numId w:val="239"/>
         </w:numPr>
         <w:spacing w:before="0" w:after="40"/>
-        <w:rPr/>
+        <w:rPr>
+          <w:highlight w:val="none"/>
+          <w:shd w:fill="81D41A" w:val="clear"/>
+        </w:rPr>
       </w:pPr>
       <w:r>
         <w:rPr>
@@ -2800,6 +2855,7 @@
           <w:color w:val="222222"/>
           <w:sz w:val="20"/>
           <w:szCs w:val="20"/>
+          <w:shd w:fill="81D41A" w:val="clear"/>
         </w:rPr>
         <w:t>Hands-on</w:t>
       </w:r>
@@ -2811,7 +2867,10 @@
           <w:bottom w:val="single" w:sz="6" w:space="2" w:color="2E7D6B"/>
         </w:pBdr>
         <w:spacing w:before="160" w:after="80"/>
-        <w:rPr/>
+        <w:rPr>
+          <w:highlight w:val="none"/>
+          <w:shd w:fill="81D41A" w:val="clear"/>
+        </w:rPr>
       </w:pPr>
       <w:r>
         <w:rPr>
@@ -2821,6 +2880,7 @@
           <w:color w:val="2E7D6B"/>
           <w:sz w:val="22"/>
           <w:szCs w:val="22"/>
+          <w:shd w:fill="81D41A" w:val="clear"/>
         </w:rPr>
         <w:t>Day 10 – Scheduling</w:t>
       </w:r>
@@ -2833,7 +2893,10 @@
           <w:numId w:val="240"/>
         </w:numPr>
         <w:spacing w:before="0" w:after="40"/>
-        <w:rPr/>
+        <w:rPr>
+          <w:highlight w:val="none"/>
+          <w:shd w:fill="81D41A" w:val="clear"/>
+        </w:rPr>
       </w:pPr>
       <w:r>
         <w:rPr>
@@ -2841,6 +2904,7 @@
           <w:color w:val="222222"/>
           <w:sz w:val="20"/>
           <w:szCs w:val="20"/>
+          <w:shd w:fill="81D41A" w:val="clear"/>
         </w:rPr>
         <w:t>Node Selectors</w:t>
       </w:r>
@@ -2853,7 +2917,10 @@
           <w:numId w:val="241"/>
         </w:numPr>
         <w:spacing w:before="0" w:after="40"/>
-        <w:rPr/>
+        <w:rPr>
+          <w:highlight w:val="none"/>
+          <w:shd w:fill="81D41A" w:val="clear"/>
+        </w:rPr>
       </w:pPr>
       <w:r>
         <w:rPr>
@@ -2861,6 +2928,7 @@
           <w:color w:val="222222"/>
           <w:sz w:val="20"/>
           <w:szCs w:val="20"/>
+          <w:shd w:fill="81D41A" w:val="clear"/>
         </w:rPr>
         <w:t>Affinity</w:t>
       </w:r>
@@ -2873,7 +2941,10 @@
           <w:numId w:val="242"/>
         </w:numPr>
         <w:spacing w:before="0" w:after="40"/>
-        <w:rPr/>
+        <w:rPr>
+          <w:highlight w:val="none"/>
+          <w:shd w:fill="81D41A" w:val="clear"/>
+        </w:rPr>
       </w:pPr>
       <w:r>
         <w:rPr>
@@ -2881,6 +2952,7 @@
           <w:color w:val="222222"/>
           <w:sz w:val="20"/>
           <w:szCs w:val="20"/>
+          <w:shd w:fill="81D41A" w:val="clear"/>
         </w:rPr>
         <w:t>Anti-Affinity</w:t>
       </w:r>
@@ -2893,7 +2965,10 @@
           <w:numId w:val="243"/>
         </w:numPr>
         <w:spacing w:before="0" w:after="40"/>
-        <w:rPr/>
+        <w:rPr>
+          <w:highlight w:val="none"/>
+          <w:shd w:fill="81D41A" w:val="clear"/>
+        </w:rPr>
       </w:pPr>
       <w:r>
         <w:rPr>
@@ -2901,6 +2976,7 @@
           <w:color w:val="222222"/>
           <w:sz w:val="20"/>
           <w:szCs w:val="20"/>
+          <w:shd w:fill="81D41A" w:val="clear"/>
         </w:rPr>
         <w:t>Taints</w:t>
       </w:r>
@@ -2913,7 +2989,10 @@
           <w:numId w:val="244"/>
         </w:numPr>
         <w:spacing w:before="0" w:after="40"/>
-        <w:rPr/>
+        <w:rPr>
+          <w:highlight w:val="none"/>
+          <w:shd w:fill="81D41A" w:val="clear"/>
+        </w:rPr>
       </w:pPr>
       <w:r>
         <w:rPr>
@@ -2921,6 +3000,7 @@
           <w:color w:val="222222"/>
           <w:sz w:val="20"/>
           <w:szCs w:val="20"/>
+          <w:shd w:fill="81D41A" w:val="clear"/>
         </w:rPr>
         <w:t>Tolerations</w:t>
       </w:r>
@@ -2933,7 +3013,10 @@
           <w:numId w:val="245"/>
         </w:numPr>
         <w:spacing w:before="0" w:after="40"/>
-        <w:rPr/>
+        <w:rPr>
+          <w:highlight w:val="none"/>
+          <w:shd w:fill="81D41A" w:val="clear"/>
+        </w:rPr>
       </w:pPr>
       <w:r>
         <w:rPr>
@@ -2941,6 +3024,7 @@
           <w:color w:val="222222"/>
           <w:sz w:val="20"/>
           <w:szCs w:val="20"/>
+          <w:shd w:fill="81D41A" w:val="clear"/>
         </w:rPr>
         <w:t>Topology Spread Constraints</w:t>
       </w:r>
@@ -2953,7 +3037,10 @@
           <w:numId w:val="246"/>
         </w:numPr>
         <w:spacing w:before="0" w:after="40"/>
-        <w:rPr/>
+        <w:rPr>
+          <w:highlight w:val="none"/>
+          <w:shd w:fill="81D41A" w:val="clear"/>
+        </w:rPr>
       </w:pPr>
       <w:r>
         <w:rPr>
@@ -2961,6 +3048,7 @@
           <w:color w:val="222222"/>
           <w:sz w:val="20"/>
           <w:szCs w:val="20"/>
+          <w:shd w:fill="81D41A" w:val="clear"/>
         </w:rPr>
         <w:t>Custom Scheduling</w:t>
       </w:r>
@@ -2973,7 +3061,10 @@
           <w:numId w:val="247"/>
         </w:numPr>
         <w:spacing w:before="0" w:after="40"/>
-        <w:rPr/>
+        <w:rPr>
+          <w:highlight w:val="none"/>
+          <w:shd w:fill="81D41A" w:val="clear"/>
+        </w:rPr>
       </w:pPr>
       <w:r>
         <w:rPr>
@@ -2981,6 +3072,7 @@
           <w:color w:val="222222"/>
           <w:sz w:val="20"/>
           <w:szCs w:val="20"/>
+          <w:shd w:fill="81D41A" w:val="clear"/>
         </w:rPr>
         <w:t>Jobs Scheduling</w:t>
       </w:r>
@@ -2993,7 +3085,10 @@
           <w:numId w:val="248"/>
         </w:numPr>
         <w:spacing w:before="0" w:after="40"/>
-        <w:rPr/>
+        <w:rPr>
+          <w:highlight w:val="none"/>
+          <w:shd w:fill="81D41A" w:val="clear"/>
+        </w:rPr>
       </w:pPr>
       <w:r>
         <w:rPr>
@@ -3001,6 +3096,7 @@
           <w:color w:val="222222"/>
           <w:sz w:val="20"/>
           <w:szCs w:val="20"/>
+          <w:shd w:fill="81D41A" w:val="clear"/>
         </w:rPr>
         <w:t>Hands-on</w:t>
       </w:r>

</xml_diff>